<commit_message>
Rapport de soutenance recit jerome added
</commit_message>
<xml_diff>
--- a/Soutenance/Soutenance.docx
+++ b/Soutenance/Soutenance.docx
@@ -789,13 +789,7 @@
         <w:ind w:firstLine="708"/>
       </w:pPr>
       <w:r>
-        <w:t xml:space="preserve">Après la remise du premier cahier des charges technique, j’ai constaté quelques déséquilibres dans la répartition des tâches. Certains membres </w:t>
-      </w:r>
-      <w:r>
-        <w:t>exerçaient</w:t>
-      </w:r>
-      <w:r>
-        <w:t xml:space="preserve"> plus de responsabilités que d’autres. J’ai donc révisé la répartition en apportant des ajustements mineurs et en consultant les autres membres pour valider ces modifications.</w:t>
+        <w:t>Après la remise du premier cahier des charges technique, j’ai constaté quelques déséquilibres dans la répartition des tâches. Certains membres exerçaient plus de responsabilités que d’autres. J’ai donc révisé la répartition en apportant des ajustements mineurs et en consultant les autres membres pour valider ces modifications.</w:t>
       </w:r>
     </w:p>
     <w:p>
@@ -891,10 +885,7 @@
         <w:ind w:firstLine="708"/>
       </w:pPr>
       <w:r>
-        <w:t>À la suite du</w:t>
-      </w:r>
-      <w:r>
-        <w:t xml:space="preserve"> départ de Matteo, l’équipe a été réduite à quatre membres. Après la soutenance, j’ai dû réarranger la répartition des tâches pour répartir équitablement la charge de travail supplémentaire. J’ai pris soin de consulter les autres membres avant de finaliser ces ajustements. Bien que chaque membre ait désormais un peu plus de travail, j’ai décidé de conserver la planification initiale en espérant que chacun respecterait ses engagements.</w:t>
+        <w:t>À la suite du départ de Matteo, l’équipe a été réduite à quatre membres. Après la soutenance, j’ai dû réarranger la répartition des tâches pour répartir équitablement la charge de travail supplémentaire. J’ai pris soin de consulter les autres membres avant de finaliser ces ajustements. Bien que chaque membre ait désormais un peu plus de travail, j’ai décidé de conserver la planification initiale en espérant que chacun respecterait ses engagements.</w:t>
       </w:r>
     </w:p>
     <w:p>
@@ -910,11 +901,6 @@
       <w:r>
         <w:t>Cette expérience en tant que chef de projet m’a confronté à des défis humains et organisationnels variés, mais elle m’a également permis de renforcer mes compétences en gestion de groupe. Malgré les imprévus, l’équipe reste soudée, et nous continuons à progresser vers la finalisation de notre jeu vidéo.</w:t>
       </w:r>
-    </w:p>
-    <w:p>
-      <w:pPr>
-        <w:pStyle w:val="NoSpacing"/>
-      </w:pPr>
     </w:p>
     <w:sectPr>
       <w:pgSz w:w="11906" w:h="16838"/>
@@ -1529,6 +1515,7 @@
   <w:style w:type="character" w:default="1" w:styleId="DefaultParagraphFont">
     <w:name w:val="Default Paragraph Font"/>
     <w:uiPriority w:val="1"/>
+    <w:semiHidden/>
     <w:unhideWhenUsed/>
   </w:style>
   <w:style w:type="table" w:default="1" w:styleId="TableNormal">

</xml_diff>